<commit_message>
Actualiza SDD §7.3 con la rúbrica breve y corrige dos promesas que no existían en código (v1.61)
El bloque nuevo de la ficha del alumno (rubricaBreve) queda documentado en
§7.3, con las cifras reales de densidad de impresión. De paso, §7.3
prometía dos cosas que el motor nunca implementó: el N4 "en segunda
persona" y el registro lingüístico ajustado por curso. Ambas se retiran
como promesa, no se dejan como deuda: el descriptor ya es la instrucción
y el registro ya lo fija el pack por curso (regla 2 de CLAUDE.md). El
guion de presentación en clase, en cambio, sí queda como deuda declarada
—estaba ya recogido en la memoria de registro como "especificado y
pendiente de renderizar"— con su ruta de implementación escrita.

El manual del docente (generar_manual.py) y el .docx generado se
actualizan igual: cinco botones en vez de cuatro, el bloque nuevo
documentado, el guion movido a "todavía no, pero está previsto".

Co-Authored-By: Claude Sonnet 5 <noreply@anthropic.com>
</commit_message>
<xml_diff>
--- a/docs/Taller-de-Rubricas_Guia-para-empezar.docx
+++ b/docs/Taller-de-Rubricas_Guia-para-empezar.docx
@@ -1660,7 +1660,7 @@
           <w:sz w:val="21"/>
           <w:rFonts w:ascii="Palatino Linotype" w:hAnsi="Palatino Linotype" w:cs="Palatino Linotype"/>
         </w:rPr>
-        <w:t xml:space="preserve">Además de las siete pestañas hay cuatro botones: </w:t>
+        <w:t xml:space="preserve">Además de las siete pestañas hay cinco botones: </w:t>
       </w:r>
       <w:r>
         <w:rPr>
@@ -1720,7 +1720,7 @@
           <w:sz w:val="21"/>
           <w:rFonts w:ascii="Palatino Linotype" w:hAnsi="Palatino Linotype" w:cs="Palatino Linotype"/>
         </w:rPr>
-        <w:t xml:space="preserve"> (apartado 8) e </w:t>
+        <w:t xml:space="preserve"> (apartado 8), </w:t>
       </w:r>
       <w:r>
         <w:rPr>
@@ -1740,7 +1740,27 @@
           <w:sz w:val="21"/>
           <w:rFonts w:ascii="Palatino Linotype" w:hAnsi="Palatino Linotype" w:cs="Palatino Linotype"/>
         </w:rPr>
-        <w:t xml:space="preserve"> — que manda a la impresora o a «Guardar como PDF» exactamente la pestaña que tengas delante, con los «¿por qué?» ocultos, porque el papel es para el aula.</w:t>
+        <w:t xml:space="preserve"> — que manda a la impresora o a «Guardar como PDF» exactamente la pestaña que tengas delante, con los «¿por qué?» ocultos, porque el papel es para el aula— e </w:t>
+      </w:r>
+      <w:r>
+        <w:rPr>
+          <w:b/>
+          <w:i w:val="0"/>
+          <w:color w:val="1C1F26"/>
+          <w:sz w:val="21"/>
+          <w:rFonts w:ascii="Palatino Linotype" w:hAnsi="Palatino Linotype" w:cs="Palatino Linotype"/>
+        </w:rPr>
+        <w:t>Imprimir solo la rúbrica breve</w:t>
+      </w:r>
+      <w:r>
+        <w:rPr>
+          <w:b w:val="0"/>
+          <w:i w:val="0"/>
+          <w:color w:val="1C1F26"/>
+          <w:sz w:val="21"/>
+          <w:rFonts w:ascii="Palatino Linotype" w:hAnsi="Palatino Linotype" w:cs="Palatino Linotype"/>
+        </w:rPr>
+        <w:t xml:space="preserve"> (apartado 4).</w:t>
       </w:r>
     </w:p>
     <w:tbl>
@@ -1792,7 +1812,7 @@
                 <w:sz w:val="20"/>
                 <w:rFonts w:ascii="Palatino Linotype" w:hAnsi="Palatino Linotype" w:cs="Palatino Linotype"/>
               </w:rPr>
-              <w:t>El registro lingüístico se ajusta al curso: la ficha de 1.º de ESO y la de 2.º de Bachillerato no le hablan igual al alumno. Está pensada para caber en un A4 y para proyectarse.</w:t>
+              <w:t>«Imprimir solo la rúbrica breve» saca en una sola hoja la tabla de los cuatro niveles que va dentro de la ficha, y nada más: ni cabecera, ni explicaciones, ni el resto de bloques. Da igual qué pestaña tengas abierta al pulsarlo. Es la hoja que el alumno tiene delante mientras escribe.</w:t>
             </w:r>
           </w:p>
         </w:tc>
@@ -1906,7 +1926,7 @@
           <w:sz w:val="21"/>
           <w:rFonts w:ascii="Palatino Linotype" w:hAnsi="Palatino Linotype" w:cs="Palatino Linotype"/>
         </w:rPr>
-        <w:t xml:space="preserve"> — el descriptor más alto de cada dimensión, convertido en instrucción accionable.</w:t>
+        <w:t xml:space="preserve"> — el descriptor más alto de cada dimensión, tal cual: ya está escrito como una instrucción (un verbo, un objeto, una condición).</w:t>
       </w:r>
     </w:p>
     <w:p>
@@ -1922,7 +1942,7 @@
           <w:sz w:val="21"/>
           <w:rFonts w:ascii="Palatino Linotype" w:hAnsi="Palatino Linotype" w:cs="Palatino Linotype"/>
         </w:rPr>
-        <w:t>Cómo se calcula la nota</w:t>
+        <w:t>La rúbrica completa, en breve</w:t>
       </w:r>
       <w:r>
         <w:rPr>
@@ -1932,33 +1952,7 @@
           <w:sz w:val="21"/>
           <w:rFonts w:ascii="Palatino Linotype" w:hAnsi="Palatino Linotype" w:cs="Palatino Linotype"/>
         </w:rPr>
-        <w:t xml:space="preserve"> — la escala elegida, sin letra pequeña.</w:t>
-      </w:r>
-    </w:p>
-    <w:p>
-      <w:pPr>
-        <w:pStyle w:val="ListBullet"/>
-        <w:spacing w:after="60"/>
-      </w:pPr>
-      <w:r>
-        <w:rPr>
-          <w:b/>
-          <w:i w:val="0"/>
-          <w:color w:val="1C1F26"/>
-          <w:sz w:val="21"/>
-          <w:rFonts w:ascii="Palatino Linotype" w:hAnsi="Palatino Linotype" w:cs="Palatino Linotype"/>
-        </w:rPr>
-        <w:t>Un guion para presentarla en clase</w:t>
-      </w:r>
-      <w:r>
-        <w:rPr>
-          <w:b w:val="0"/>
-          <w:i w:val="0"/>
-          <w:color w:val="1C1F26"/>
-          <w:sz w:val="21"/>
-          <w:rFonts w:ascii="Palatino Linotype" w:hAnsi="Palatino Linotype" w:cs="Palatino Linotype"/>
-        </w:rPr>
-        <w:t xml:space="preserve"> — media página para ti: apertura, recorrido dimensión a dimensión, un ejemplo contrastado de N2 frente a N4 y dos preguntas para lanzar al grupo. Pensado para cinco o diez minutos.</w:t>
+        <w:t xml:space="preserve"> — la tabla de los cuatro niveles, con el nombre de cada dimensión y su peso, sin el criterio oficial ni la etiqueta del bloque: eso es para ti, no para el alumno. Ningún descriptor se recorta. Tiene su propio botón de impresión, que la saca sola en una hoja.</w:t>
       </w:r>
     </w:p>
     <w:p>
@@ -1985,6 +1979,64 @@
           <w:rFonts w:ascii="Palatino Linotype" w:hAnsi="Palatino Linotype" w:cs="Palatino Linotype"/>
         </w:rPr>
         <w:t xml:space="preserve"> — si ya has calificado, un desplegable muestra su nivel y sus puntos por dimensión y la nota final. Para la entrega individual.</w:t>
+      </w:r>
+    </w:p>
+    <w:p>
+      <w:pPr>
+        <w:pStyle w:val="ListBullet"/>
+        <w:spacing w:after="60"/>
+      </w:pPr>
+      <w:r>
+        <w:rPr>
+          <w:b/>
+          <w:i w:val="0"/>
+          <w:color w:val="1C1F26"/>
+          <w:sz w:val="21"/>
+          <w:rFonts w:ascii="Palatino Linotype" w:hAnsi="Palatino Linotype" w:cs="Palatino Linotype"/>
+        </w:rPr>
+        <w:t>Cómo se calcula la nota</w:t>
+      </w:r>
+      <w:r>
+        <w:rPr>
+          <w:b w:val="0"/>
+          <w:i w:val="0"/>
+          <w:color w:val="1C1F26"/>
+          <w:sz w:val="21"/>
+          <w:rFonts w:ascii="Palatino Linotype" w:hAnsi="Palatino Linotype" w:cs="Palatino Linotype"/>
+        </w:rPr>
+        <w:t xml:space="preserve"> — una frase: se valora el nivel alcanzado en cada dimensión por su descriptor. La aritmética, cuando la hay, la ves en «Calificar».</w:t>
+      </w:r>
+    </w:p>
+    <w:p>
+      <w:r>
+        <w:rPr>
+          <w:b w:val="0"/>
+          <w:i w:val="0"/>
+          <w:color w:val="1C1F26"/>
+          <w:sz w:val="21"/>
+          <w:rFonts w:ascii="Palatino Linotype" w:hAnsi="Palatino Linotype" w:cs="Palatino Linotype"/>
+        </w:rPr>
+        <w:t xml:space="preserve">Lo que la ficha </w:t>
+      </w:r>
+      <w:r>
+        <w:rPr>
+          <w:b/>
+          <w:i w:val="0"/>
+          <w:color w:val="1C1F26"/>
+          <w:sz w:val="21"/>
+          <w:rFonts w:ascii="Palatino Linotype" w:hAnsi="Palatino Linotype" w:cs="Palatino Linotype"/>
+        </w:rPr>
+        <w:t>no</w:t>
+      </w:r>
+      <w:r>
+        <w:rPr>
+          <w:b w:val="0"/>
+          <w:i w:val="0"/>
+          <w:color w:val="1C1F26"/>
+          <w:sz w:val="21"/>
+          <w:rFonts w:ascii="Palatino Linotype" w:hAnsi="Palatino Linotype" w:cs="Palatino Linotype"/>
+        </w:rPr>
+        <w:t xml:space="preserve"> trae todavía es el guion para presentarla en clase —media página para ti, con apertura, recorrido dimensión a dimensión, un N2 frente a un N4 y dos preguntas para el grupo—. Está diseñado y en la lista de lo previsto (apartado 10).</w:t>
       </w:r>
     </w:p>
     <w:p>
@@ -5290,6 +5342,48 @@
                 <w:sz w:val="19"/>
                 <w:rFonts w:ascii="Palatino Linotype" w:hAnsi="Palatino Linotype" w:cs="Palatino Linotype"/>
               </w:rPr>
+              <w:t>Guion para presentar la ficha en clase</w:t>
+            </w:r>
+          </w:p>
+        </w:tc>
+        <w:tc>
+          <w:tcPr>
+            <w:tcW w:type="dxa" w:w="6576"/>
+          </w:tcPr>
+          <w:p>
+            <w:pPr>
+              <w:spacing w:before="60" w:after="60"/>
+            </w:pPr>
+            <w:r>
+              <w:rPr>
+                <w:b w:val="0"/>
+                <w:i w:val="0"/>
+                <w:color w:val="1C1F26"/>
+                <w:sz w:val="19"/>
+                <w:rFonts w:ascii="Palatino Linotype" w:hAnsi="Palatino Linotype" w:cs="Palatino Linotype"/>
+              </w:rPr>
+              <w:t>Media página para ti: apertura, recorrido dimensión a dimensión, un N2 frente a un N4 y dos preguntas para el grupo. Diseñado, no implementado.</w:t>
+            </w:r>
+          </w:p>
+        </w:tc>
+      </w:tr>
+      <w:tr>
+        <w:tc>
+          <w:tcPr>
+            <w:tcW w:type="dxa" w:w="2835"/>
+          </w:tcPr>
+          <w:p>
+            <w:pPr>
+              <w:spacing w:before="60" w:after="60"/>
+            </w:pPr>
+            <w:r>
+              <w:rPr>
+                <w:b w:val="0"/>
+                <w:i w:val="0"/>
+                <w:color w:val="1C1F26"/>
+                <w:sz w:val="19"/>
+                <w:rFonts w:ascii="Palatino Linotype" w:hAnsi="Palatino Linotype" w:cs="Palatino Linotype"/>
+              </w:rPr>
               <w:t>Guardar la configuración en «.json»</w:t>
             </w:r>
           </w:p>
@@ -6592,7 +6686,7 @@
                 <w:sz w:val="19"/>
                 <w:rFonts w:ascii="Palatino Linotype" w:hAnsi="Palatino Linotype" w:cs="Palatino Linotype"/>
               </w:rPr>
-              <w:t>Por eso la ficha no es una tabla: es una hoja que dice qué se te pide, qué se valora, por qué unas cosas pesan más y cómo se llega al nivel excelente. Y viene con un guion de cinco a diez minutos para presentarla en clase.</w:t>
+              <w:t>Por eso la ficha no es solo una tabla: es una hoja que dice qué se te pide, qué se valora, por qué unas cosas pesan más y cómo se llega al nivel excelente, y la tabla de los cuatro niveles va al final, en breve, para que la tengan delante mientras escriben.</w:t>
             </w:r>
           </w:p>
         </w:tc>

</xml_diff>